<commit_message>
Two more annotated figures in the Handbuch
The restore preview and the repair history dialog, both captured from the running
app with numbered callouts placed from the live control rectangles. The manual
now carries five figures: the main window with eleven callouts, the login dialog,
the login dialog with a separate mirror account, the preview before writing, and
the repair history with its double-guarded undo. 14 -> 16 pages.

The preview needed a 45 s settle: captured earlier it showed "Comparing 17/77"
with the Restore button still disabled, which would have put a half-loaded dialog
in the manual.

The repair history is shown empty, because a demo session has no journal. Kept
anyway and said so in the caption - it is the screen that shows the undo is
double-guarded, which is the point worth documenting.

Co-Authored-By: Claude Opus 5 <noreply@anthropic.com>
</commit_message>
<xml_diff>
--- a/docs/Handbuch-DE.docx
+++ b/docs/Handbuch-DE.docx
@@ -2562,6 +2562,86 @@
     </w:p>
     <w:p>
       <w:pPr>
+        <w:keepNext/>
+        <w:spacing w:before="80" w:after="20"/>
+        <w:jc w:val="center"/>
+      </w:pPr>
+      <w:r>
+        <w:drawing>
+          <wp:inline xmlns:wp="http://schemas.openxmlformats.org/drawingml/2006/wordprocessingDrawing" distT="0" distB="0" distL="0" distR="0">
+            <wp:extent cx="5760000" cy="4411915"/>
+            <wp:effectExtent l="0" t="0" r="0" b="0"/>
+            <wp:docPr id="1005" name="Picture 1005"/>
+            <wp:cNvGraphicFramePr/>
+            <a:graphic xmlns:a="http://schemas.openxmlformats.org/drawingml/2006/main">
+              <a:graphicData uri="http://schemas.openxmlformats.org/drawingml/2006/picture">
+                <pic:pic xmlns:pic="http://schemas.openxmlformats.org/drawingml/2006/picture">
+                  <pic:nvPicPr>
+                    <pic:cNvPr id="1005" name="04-preview.png"/>
+                    <pic:cNvPicPr/>
+                  </pic:nvPicPr>
+                  <pic:blipFill>
+                    <a:blip xmlns:r="http://schemas.openxmlformats.org/officeDocument/2006/relationships" r:embed="rId105"/>
+                    <a:stretch>
+                      <a:fillRect/>
+                    </a:stretch>
+                  </pic:blipFill>
+                  <pic:spPr>
+                    <a:xfrm>
+                      <a:off x="0" y="0"/>
+                      <a:ext cx="5760000" cy="4411915"/>
+                    </a:xfrm>
+                    <a:prstGeom prst="rect">
+                      <a:avLst/>
+                    </a:prstGeom>
+                  </pic:spPr>
+                </pic:pic>
+              </a:graphicData>
+            </a:graphic>
+          </wp:inline>
+        </w:drawing>
+      </w:r>
+    </w:p>
+    <w:p>
+      <w:pPr>
+        <w:spacing w:after="100" w:line="240" w:lineRule="auto"/>
+        <w:rPr>
+          <w:i/>
+        </w:rPr>
+      </w:pPr>
+      <w:r>
+        <w:rPr>
+          <w:i/>
+        </w:rPr>
+        <w:t xml:space="preserve">Die Vorschau vor dem Schreiben. Links, was auf dem Spiegel fehlt, rechts, was auf dem Hauptserver fehlt; unten die Zeitachse der markierten Messstelle. </w:t>
+      </w:r>
+      <w:r>
+        <w:rPr>
+          <w:b/>
+        </w:rPr>
+        <w:t xml:space="preserve">1</w:t>
+      </w:r>
+      <w:r>
+        <w:rPr>
+          <w:i/>
+        </w:rPr>
+        <w:t xml:space="preserve"> startet die Wiederherstellung, </w:t>
+      </w:r>
+      <w:r>
+        <w:rPr>
+          <w:b/>
+        </w:rPr>
+        <w:t xml:space="preserve">2</w:t>
+      </w:r>
+      <w:r>
+        <w:rPr>
+          <w:i/>
+        </w:rPr>
+        <w:t xml:space="preserve"> bricht ohne jede Änderung ab.</w:t>
+      </w:r>
+    </w:p>
+    <w:p>
+      <w:pPr>
         <w:ind w:left="454" w:hanging="227"/>
         <w:spacing w:after="60"/>
       </w:pPr>
@@ -2754,6 +2834,94 @@
       </w:r>
       <w:r>
         <w:t xml:space="preserve"> listet jede durchgeführte Wiederherstellung auf: wann, in welche Richtung, wie viele Messwerte, und ob sie inzwischen rückgängig gemacht wurde.</w:t>
+      </w:r>
+    </w:p>
+    <w:p>
+      <w:pPr>
+        <w:keepNext/>
+        <w:spacing w:before="80" w:after="20"/>
+        <w:jc w:val="center"/>
+      </w:pPr>
+      <w:r>
+        <w:drawing>
+          <wp:inline xmlns:wp="http://schemas.openxmlformats.org/drawingml/2006/wordprocessingDrawing" distT="0" distB="0" distL="0" distR="0">
+            <wp:extent cx="5760000" cy="3482791"/>
+            <wp:effectExtent l="0" t="0" r="0" b="0"/>
+            <wp:docPr id="1006" name="Picture 1006"/>
+            <wp:cNvGraphicFramePr/>
+            <a:graphic xmlns:a="http://schemas.openxmlformats.org/drawingml/2006/main">
+              <a:graphicData uri="http://schemas.openxmlformats.org/drawingml/2006/picture">
+                <pic:pic xmlns:pic="http://schemas.openxmlformats.org/drawingml/2006/picture">
+                  <pic:nvPicPr>
+                    <pic:cNvPr id="1006" name="05-history.png"/>
+                    <pic:cNvPicPr/>
+                  </pic:nvPicPr>
+                  <pic:blipFill>
+                    <a:blip xmlns:r="http://schemas.openxmlformats.org/officeDocument/2006/relationships" r:embed="rId106"/>
+                    <a:stretch>
+                      <a:fillRect/>
+                    </a:stretch>
+                  </pic:blipFill>
+                  <pic:spPr>
+                    <a:xfrm>
+                      <a:off x="0" y="0"/>
+                      <a:ext cx="5760000" cy="3482791"/>
+                    </a:xfrm>
+                    <a:prstGeom prst="rect">
+                      <a:avLst/>
+                    </a:prstGeom>
+                  </pic:spPr>
+                </pic:pic>
+              </a:graphicData>
+            </a:graphic>
+          </wp:inline>
+        </w:drawing>
+      </w:r>
+    </w:p>
+    <w:p>
+      <w:pPr>
+        <w:spacing w:after="100" w:line="240" w:lineRule="auto"/>
+        <w:rPr>
+          <w:i/>
+        </w:rPr>
+      </w:pPr>
+      <w:r>
+        <w:rPr>
+          <w:i/>
+        </w:rPr>
+        <w:t xml:space="preserve">Der Reparaturverlauf, hier noch ohne Einträge. Rückgängig ist doppelt gesichert: erst *</w:t>
+      </w:r>
+      <w:r>
+        <w:rPr>
+          <w:i/>
+        </w:rPr>
+        <w:t xml:space="preserve">1</w:t>
+      </w:r>
+    </w:p>
+    <w:p>
+      <w:pPr>
+        <w:spacing w:after="100" w:line="240" w:lineRule="auto"/>
+      </w:pPr>
+      <w:r>
+        <w:t xml:space="preserve">freigeben, dann </w:t>
+      </w:r>
+      <w:r>
+        <w:rPr>
+          <w:b/>
+        </w:rPr>
+        <w:t xml:space="preserve">2</w:t>
+      </w:r>
+      <w:r>
+        <w:t xml:space="preserve"> ausführen; </w:t>
+      </w:r>
+      <w:r>
+        <w:rPr>
+          <w:b/>
+        </w:rPr>
+        <w:t xml:space="preserve">3</w:t>
+      </w:r>
+      <w:r>
+        <w:t xml:space="preserve"> öffnet den Bericht des ausgewählten Laufs.*</w:t>
       </w:r>
     </w:p>
     <w:p>

</xml_diff>